<commit_message>
Desarrollo memoria del proyecto
Agragado de apartados de anexo y tecnologias pendientes
e inicio de apartados de dearrrollo y metodologia del proyecto
</commit_message>
<xml_diff>
--- a/Documentacion/Proyecto/Memoria_proyecto_integrador.docx
+++ b/Documentacion/Proyecto/Memoria_proyecto_integrador.docx
@@ -1474,7 +1474,40 @@
         <w:t>Palabras clave:</w:t>
       </w:r>
       <w:r>
-        <w:t xml:space="preserve"> palabra 1; palabra 2; palabra 3; palabra 4; palabra 5.</w:t>
+        <w:t xml:space="preserve"> </w:t>
+      </w:r>
+      <w:proofErr w:type="spellStart"/>
+      <w:r>
+        <w:t>Gestion</w:t>
+      </w:r>
+      <w:proofErr w:type="spellEnd"/>
+      <w:r>
+        <w:t xml:space="preserve">; </w:t>
+      </w:r>
+      <w:r>
+        <w:t>Diseño</w:t>
+      </w:r>
+      <w:r>
+        <w:t xml:space="preserve">; </w:t>
+      </w:r>
+      <w:proofErr w:type="spellStart"/>
+      <w:r>
+        <w:t>Planificacion</w:t>
+      </w:r>
+      <w:proofErr w:type="spellEnd"/>
+      <w:r>
+        <w:t xml:space="preserve">; </w:t>
+      </w:r>
+      <w:r>
+        <w:t xml:space="preserve">Usuario; </w:t>
+      </w:r>
+      <w:proofErr w:type="spellStart"/>
+      <w:r>
+        <w:t>Programacion</w:t>
+      </w:r>
+      <w:proofErr w:type="spellEnd"/>
+      <w:r>
+        <w:t>.</w:t>
       </w:r>
     </w:p>
     <w:p/>
@@ -2085,22 +2118,161 @@
       <w:bookmarkEnd w:id="5"/>
     </w:p>
     <w:p>
-      <w:r>
-        <w:t xml:space="preserve">Para este apartado se recomienda una extensión de </w:t>
-      </w:r>
-      <w:r>
-        <w:t>2</w:t>
-      </w:r>
-      <w:r>
-        <w:t xml:space="preserve"> a </w:t>
-      </w:r>
-      <w:r>
-        <w:t>3</w:t>
-      </w:r>
-      <w:r>
-        <w:t xml:space="preserve"> páginas. Enumeración de las tecnologías, herramientas y lenguajes de programación utilizados durante el desarrollo del proyecto. Enumeración de las herramientas organizativas para favorecer el trabajo en equipo.</w:t>
-      </w:r>
-    </w:p>
+      <w:bookmarkStart w:id="6" w:name="_558c8jk18t4h" w:colFirst="0" w:colLast="0"/>
+      <w:bookmarkEnd w:id="6"/>
+      <w:r>
+        <w:t>La</w:t>
+      </w:r>
+      <w:r>
+        <w:t xml:space="preserve"> elaboración del proyecto</w:t>
+      </w:r>
+      <w:r>
+        <w:t xml:space="preserve"> abarcó áreas y tecnologías que van desde la parte más práctica, como la programación orientada a </w:t>
+      </w:r>
+      <w:r>
+        <w:t>objetos,</w:t>
+      </w:r>
+      <w:r>
+        <w:t xml:space="preserve"> las bases de datos SQL</w:t>
+      </w:r>
+      <w:r>
+        <w:t xml:space="preserve"> y la creación de interfaces graficas</w:t>
+      </w:r>
+      <w:r>
+        <w:t>, hasta la parte más teórica, como la elaboración de diagramas MER, UML y Gantt. Estos últimos fueron clave para establecer las bases conceptuales sobre el funcionamiento interno de la gestión de citas, clientes, talleres y empleados</w:t>
+      </w:r>
+      <w:r>
+        <w:t>; las tecnologías utilizadas para trabajar en las áreas anteriormente mencionadas fueron:</w:t>
+      </w:r>
+    </w:p>
+    <w:p>
+      <w:proofErr w:type="spellStart"/>
+      <w:r>
+        <w:t>Programacion</w:t>
+      </w:r>
+      <w:proofErr w:type="spellEnd"/>
+      <w:r>
+        <w:t>:</w:t>
+      </w:r>
+    </w:p>
+    <w:p>
+      <w:r>
+        <w:t>Java (JDK): Lenguaje de programación principal para el desarrollo de la lógica y la arquitectura orientada a objetos.</w:t>
+      </w:r>
+    </w:p>
+    <w:p>
+      <w:r>
+        <w:t>Eclipse IDE: Entorno de Desarrollo Integrado utilizado para escribir, compilar y probar el código.</w:t>
+      </w:r>
+    </w:p>
+    <w:p>
+      <w:r>
+        <w:t>Gestión de Base de Datos:</w:t>
+      </w:r>
+    </w:p>
+    <w:p>
+      <w:r>
+        <w:t xml:space="preserve">MySQL Server &amp; </w:t>
+      </w:r>
+      <w:proofErr w:type="spellStart"/>
+      <w:r>
+        <w:t>Workbench</w:t>
+      </w:r>
+      <w:proofErr w:type="spellEnd"/>
+      <w:r>
+        <w:t>: Sistema gestor utilizado para la creación y administración de la base de datos relacional, así como para la manipulación visual de las tablas y consultas.</w:t>
+      </w:r>
+    </w:p>
+    <w:p>
+      <w:r>
+        <w:t xml:space="preserve">Diseño y Modelado </w:t>
+      </w:r>
+    </w:p>
+    <w:p>
+      <w:r>
+        <w:t>Arquitectura del proyecto</w:t>
+      </w:r>
+      <w:r>
+        <w:t>:</w:t>
+      </w:r>
+    </w:p>
+    <w:p>
+      <w:proofErr w:type="spellStart"/>
+      <w:r>
+        <w:t>WireFrameSketcher</w:t>
+      </w:r>
+      <w:proofErr w:type="spellEnd"/>
+      <w:r>
+        <w:t>: Plugin integrado en Eclipse utilizado para el diseño, maquetado y prototipado de las ventanas de la interfaz gráfica.</w:t>
+      </w:r>
+    </w:p>
+    <w:p>
+      <w:r>
+        <w:t xml:space="preserve">Adobe </w:t>
+      </w:r>
+      <w:proofErr w:type="spellStart"/>
+      <w:r>
+        <w:t>Illustrator</w:t>
+      </w:r>
+      <w:proofErr w:type="spellEnd"/>
+      <w:r>
+        <w:t>: Herramienta de diseño vectorial utilizada específicamente para la creación del logotipo de la aplicación.</w:t>
+      </w:r>
+    </w:p>
+    <w:p>
+      <w:r>
+        <w:t>Draw.io: Herramienta gráfica empleada para la elaboración de los diagramas estructurales (Modelo Entidad/Relación, Casos de Uso, Diagrama de Clases).</w:t>
+      </w:r>
+    </w:p>
+    <w:p>
+      <w:r>
+        <w:t>Gestión del Proyecto y Control de Versiones:</w:t>
+      </w:r>
+    </w:p>
+    <w:p>
+      <w:r>
+        <w:t xml:space="preserve">Trello: Herramienta basada en tableros Kanban para la planificación ágil y el seguimiento de las tareas de los </w:t>
+      </w:r>
+      <w:proofErr w:type="spellStart"/>
+      <w:r>
+        <w:t>Sprints</w:t>
+      </w:r>
+      <w:proofErr w:type="spellEnd"/>
+      <w:r>
+        <w:t>.</w:t>
+      </w:r>
+    </w:p>
+    <w:p>
+      <w:r>
+        <w:lastRenderedPageBreak/>
+        <w:t>Online Gantt (Web): Aplicación web utilizada para generar el diagrama de Gantt, facilitando la secuenciación temporal y visual del proyecto.</w:t>
+      </w:r>
+    </w:p>
+    <w:p>
+      <w:r>
+        <w:t>GitHub: Plataforma de alojamiento para el control de versiones del código fuente y el trabajo colaborativo del equipo</w:t>
+      </w:r>
+    </w:p>
+    <w:p/>
+    <w:p/>
+    <w:p/>
+    <w:p/>
+    <w:p/>
+    <w:p/>
+    <w:p/>
+    <w:p/>
+    <w:p/>
+    <w:p/>
+    <w:p/>
+    <w:p/>
+    <w:p/>
+    <w:p/>
+    <w:p/>
+    <w:p/>
+    <w:p/>
+    <w:p/>
+    <w:p/>
+    <w:p/>
     <w:p>
       <w:pPr>
         <w:pStyle w:val="Ttulo1"/>
@@ -2109,59 +2281,216 @@
           <w:numId w:val="1"/>
         </w:numPr>
       </w:pPr>
-      <w:bookmarkStart w:id="6" w:name="_Toc224148678"/>
-      <w:r>
+      <w:bookmarkStart w:id="7" w:name="_Toc224148678"/>
+      <w:r>
+        <w:lastRenderedPageBreak/>
         <w:t>Desarrollo e implementación</w:t>
       </w:r>
-      <w:bookmarkEnd w:id="6"/>
-    </w:p>
-    <w:p>
-      <w:r>
-        <w:t xml:space="preserve">Para este apartado se recomienda una extensión de </w:t>
-      </w:r>
-      <w:r>
-        <w:t>7</w:t>
-      </w:r>
-      <w:r>
-        <w:t xml:space="preserve"> a 1</w:t>
-      </w:r>
-      <w:r>
-        <w:t>5</w:t>
-      </w:r>
-      <w:r>
-        <w:t xml:space="preserve"> páginas. </w:t>
-      </w:r>
-      <w:r>
-        <w:t>Comenzar con los diagramas (diagrama de caso de uso, diagrama de clases</w:t>
-      </w:r>
-      <w:r>
-        <w:t>, diagrama relacional</w:t>
-      </w:r>
-      <w:r>
-        <w:t xml:space="preserve"> y MER). </w:t>
-      </w:r>
-      <w:r>
-        <w:t xml:space="preserve">Detalles sobre cómo está construida la aplicación, funcionamiento, relación de la aplicación con la base de </w:t>
-      </w:r>
-      <w:r>
-        <w:t>datos, diseño del logo y por qué se ha optado por ese diseño</w:t>
-      </w:r>
-      <w:r>
-        <w:t>, pruebas realizadas</w:t>
-      </w:r>
-      <w:r>
-        <w:t xml:space="preserve"> a la aplicación (y qué pruebas se han realizado en caso de ser pruebas manuales)</w:t>
-      </w:r>
-      <w:r>
-        <w:t xml:space="preserve">, y cualquier detalle sobre el funcionamiento del proyecto. Se debe mostrar directamente el resultado, y no como si fuera trabajo en progreso. Se </w:t>
-      </w:r>
-      <w:r>
-        <w:t>pueden</w:t>
-      </w:r>
-      <w:r>
-        <w:t xml:space="preserve"> incluir capturas de pantalla de la aplicación en este apartado.</w:t>
-      </w:r>
-    </w:p>
+      <w:bookmarkEnd w:id="7"/>
+    </w:p>
+    <w:p>
+      <w:r>
+        <w:t xml:space="preserve">El inicio del desarrollo del proyecto se dio con la planificación estructural de como queríamos que nuestra aplicación gestionara la lógica de creación, modificación y eliminación de todo lo que involucra el diseño de trajes (citas, clientes, empleados y talleres); para la planificación y aterrizado de todos estos detalles se decidió iniciar por lo mas importante, la base de datos, estableciendo que entidades interactúan en la gestión y como lo hacen, por lo que el primer paso </w:t>
+      </w:r>
+      <w:proofErr w:type="spellStart"/>
+      <w:r>
+        <w:t>logico</w:t>
+      </w:r>
+      <w:proofErr w:type="spellEnd"/>
+      <w:r>
+        <w:t xml:space="preserve"> fue la creación del diagrama Entidad relación.</w:t>
+      </w:r>
+    </w:p>
+    <w:p>
+      <w:r>
+        <w:drawing>
+          <wp:inline distT="0" distB="0" distL="0" distR="0" wp14:anchorId="355412C0" wp14:editId="765B4F41">
+            <wp:extent cx="5759450" cy="3237865"/>
+            <wp:effectExtent l="0" t="0" r="0" b="635"/>
+            <wp:docPr id="497448104" name="Imagen 1"/>
+            <wp:cNvGraphicFramePr>
+              <a:graphicFrameLocks xmlns:a="http://schemas.openxmlformats.org/drawingml/2006/main" noChangeAspect="1"/>
+            </wp:cNvGraphicFramePr>
+            <a:graphic xmlns:a="http://schemas.openxmlformats.org/drawingml/2006/main">
+              <a:graphicData uri="http://schemas.openxmlformats.org/drawingml/2006/picture">
+                <pic:pic xmlns:pic="http://schemas.openxmlformats.org/drawingml/2006/picture">
+                  <pic:nvPicPr>
+                    <pic:cNvPr id="497448104" name=""/>
+                    <pic:cNvPicPr/>
+                  </pic:nvPicPr>
+                  <pic:blipFill>
+                    <a:blip r:embed="rId10"/>
+                    <a:stretch>
+                      <a:fillRect/>
+                    </a:stretch>
+                  </pic:blipFill>
+                  <pic:spPr>
+                    <a:xfrm>
+                      <a:off x="0" y="0"/>
+                      <a:ext cx="5759450" cy="3237865"/>
+                    </a:xfrm>
+                    <a:prstGeom prst="rect">
+                      <a:avLst/>
+                    </a:prstGeom>
+                  </pic:spPr>
+                </pic:pic>
+              </a:graphicData>
+            </a:graphic>
+          </wp:inline>
+        </w:drawing>
+      </w:r>
+    </w:p>
+    <w:p>
+      <w:r>
+        <w:t>En este paso se plantearon gráficamente las distintas interacciones contempladas en la lógica de gestión de los datos, por ejemplo, la cita como entidad cuenta con dos relaciones con empleado, ya que una cita obligatoriamente debe ser dirigida por un empleado y puede (o no) ser asistida por uno o dos empleados más; modelar este diagrama dio paso a una idea mas real y estructurada de la aplicación que a su vez, como lógica consecuencia, dio paso a la creación del modelo relacional donde declaramos explícitamente la estructura de las tablas de cada entidad, sus atributos y sus referencias a otras tablas, todo basándonos en lo contemplado en el diagrama entidad relación (entidades relaciones y cardinalidades).</w:t>
+      </w:r>
+    </w:p>
+    <w:p/>
+    <w:p/>
+    <w:p/>
+    <w:p>
+      <w:r>
+        <w:lastRenderedPageBreak/>
+        <w:drawing>
+          <wp:inline distT="0" distB="0" distL="0" distR="0" wp14:anchorId="0811C2C8" wp14:editId="3BEBC488">
+            <wp:extent cx="5759450" cy="4415790"/>
+            <wp:effectExtent l="0" t="0" r="0" b="3810"/>
+            <wp:docPr id="533867722" name="Imagen 1"/>
+            <wp:cNvGraphicFramePr>
+              <a:graphicFrameLocks xmlns:a="http://schemas.openxmlformats.org/drawingml/2006/main" noChangeAspect="1"/>
+            </wp:cNvGraphicFramePr>
+            <a:graphic xmlns:a="http://schemas.openxmlformats.org/drawingml/2006/main">
+              <a:graphicData uri="http://schemas.openxmlformats.org/drawingml/2006/picture">
+                <pic:pic xmlns:pic="http://schemas.openxmlformats.org/drawingml/2006/picture">
+                  <pic:nvPicPr>
+                    <pic:cNvPr id="533867722" name=""/>
+                    <pic:cNvPicPr/>
+                  </pic:nvPicPr>
+                  <pic:blipFill>
+                    <a:blip r:embed="rId11"/>
+                    <a:stretch>
+                      <a:fillRect/>
+                    </a:stretch>
+                  </pic:blipFill>
+                  <pic:spPr>
+                    <a:xfrm>
+                      <a:off x="0" y="0"/>
+                      <a:ext cx="5759450" cy="4415790"/>
+                    </a:xfrm>
+                    <a:prstGeom prst="rect">
+                      <a:avLst/>
+                    </a:prstGeom>
+                  </pic:spPr>
+                </pic:pic>
+              </a:graphicData>
+            </a:graphic>
+          </wp:inline>
+        </w:drawing>
+      </w:r>
+    </w:p>
+    <w:p>
+      <w:r>
+        <w:t xml:space="preserve">Con el diagrama del modelo relacional ya existe un acercamiento directo a la creación de la base de datos en MYSQL </w:t>
+      </w:r>
+      <w:proofErr w:type="spellStart"/>
+      <w:r>
+        <w:t>Workbench</w:t>
+      </w:r>
+      <w:proofErr w:type="spellEnd"/>
+      <w:r>
+        <w:t>, pero en este punto consideramos que no se tuvo toda la arquitectura de lógica necesaria para iniciar con la declaración de creación de tablas.</w:t>
+      </w:r>
+    </w:p>
+    <w:p>
+      <w:r>
+        <w:t xml:space="preserve">Una de las faltas evidenciadas fue saber el como el usuario final interactuaría con la aplicación y por consecuente con la base de datos, para modelar esto la herramienta utilizada fue el diagrama de casos de uso, donde se contempla que actores usaran la aplicación y que características se espera que puedan utilizar, esto tomando en cuenta </w:t>
+      </w:r>
+      <w:r>
+        <w:t xml:space="preserve">el planteamiento de las distintas categorías que un empleado puede tener </w:t>
+      </w:r>
+    </w:p>
+    <w:p>
+      <w:r>
+        <w:lastRenderedPageBreak/>
+        <w:drawing>
+          <wp:inline distT="0" distB="0" distL="0" distR="0" wp14:anchorId="10767E14" wp14:editId="3852BD81">
+            <wp:extent cx="5759450" cy="3671570"/>
+            <wp:effectExtent l="0" t="0" r="0" b="5080"/>
+            <wp:docPr id="322464636" name="Imagen 1"/>
+            <wp:cNvGraphicFramePr>
+              <a:graphicFrameLocks xmlns:a="http://schemas.openxmlformats.org/drawingml/2006/main" noChangeAspect="1"/>
+            </wp:cNvGraphicFramePr>
+            <a:graphic xmlns:a="http://schemas.openxmlformats.org/drawingml/2006/main">
+              <a:graphicData uri="http://schemas.openxmlformats.org/drawingml/2006/picture">
+                <pic:pic xmlns:pic="http://schemas.openxmlformats.org/drawingml/2006/picture">
+                  <pic:nvPicPr>
+                    <pic:cNvPr id="322464636" name=""/>
+                    <pic:cNvPicPr/>
+                  </pic:nvPicPr>
+                  <pic:blipFill>
+                    <a:blip r:embed="rId12"/>
+                    <a:stretch>
+                      <a:fillRect/>
+                    </a:stretch>
+                  </pic:blipFill>
+                  <pic:spPr>
+                    <a:xfrm>
+                      <a:off x="0" y="0"/>
+                      <a:ext cx="5759450" cy="3671570"/>
+                    </a:xfrm>
+                    <a:prstGeom prst="rect">
+                      <a:avLst/>
+                    </a:prstGeom>
+                  </pic:spPr>
+                </pic:pic>
+              </a:graphicData>
+            </a:graphic>
+          </wp:inline>
+        </w:drawing>
+      </w:r>
+    </w:p>
+    <w:p>
+      <w:r>
+        <w:drawing>
+          <wp:inline distT="0" distB="0" distL="0" distR="0" wp14:anchorId="41FA0A4F" wp14:editId="2D76E3A7">
+            <wp:extent cx="5759450" cy="3065145"/>
+            <wp:effectExtent l="0" t="0" r="0" b="1905"/>
+            <wp:docPr id="412503950" name="Imagen 1"/>
+            <wp:cNvGraphicFramePr>
+              <a:graphicFrameLocks xmlns:a="http://schemas.openxmlformats.org/drawingml/2006/main" noChangeAspect="1"/>
+            </wp:cNvGraphicFramePr>
+            <a:graphic xmlns:a="http://schemas.openxmlformats.org/drawingml/2006/main">
+              <a:graphicData uri="http://schemas.openxmlformats.org/drawingml/2006/picture">
+                <pic:pic xmlns:pic="http://schemas.openxmlformats.org/drawingml/2006/picture">
+                  <pic:nvPicPr>
+                    <pic:cNvPr id="412503950" name=""/>
+                    <pic:cNvPicPr/>
+                  </pic:nvPicPr>
+                  <pic:blipFill>
+                    <a:blip r:embed="rId13"/>
+                    <a:stretch>
+                      <a:fillRect/>
+                    </a:stretch>
+                  </pic:blipFill>
+                  <pic:spPr>
+                    <a:xfrm>
+                      <a:off x="0" y="0"/>
+                      <a:ext cx="5759450" cy="3065145"/>
+                    </a:xfrm>
+                    <a:prstGeom prst="rect">
+                      <a:avLst/>
+                    </a:prstGeom>
+                  </pic:spPr>
+                </pic:pic>
+              </a:graphicData>
+            </a:graphic>
+          </wp:inline>
+        </w:drawing>
+      </w:r>
+    </w:p>
+    <w:p/>
+    <w:p/>
+    <w:p/>
     <w:p>
       <w:pPr>
         <w:pStyle w:val="Ttulo1"/>
@@ -2170,68 +2499,87 @@
           <w:numId w:val="1"/>
         </w:numPr>
       </w:pPr>
-      <w:bookmarkStart w:id="7" w:name="_Toc224148679"/>
-      <w:r>
+      <w:bookmarkStart w:id="8" w:name="_Toc224148679"/>
+      <w:r>
+        <w:lastRenderedPageBreak/>
         <w:t>Metodología</w:t>
       </w:r>
-      <w:bookmarkEnd w:id="7"/>
-    </w:p>
-    <w:p>
-      <w:r>
-        <w:t xml:space="preserve">Para este apartado se recomienda una extensión de 3 a </w:t>
-      </w:r>
-      <w:r>
-        <w:t>6</w:t>
-      </w:r>
-      <w:r>
-        <w:t xml:space="preserve"> páginas. Explicación de cómo se ha aplicado la metodología Scrum al trabajo, representando el flujo de trabajo con</w:t>
-      </w:r>
-      <w:r>
-        <w:t xml:space="preserve"> un Diagrama de Gantt,</w:t>
-      </w:r>
-      <w:r>
-        <w:t xml:space="preserve"> Sprint Backlog y</w:t>
-      </w:r>
-      <w:r>
-        <w:t>/o</w:t>
-      </w:r>
+      <w:bookmarkEnd w:id="8"/>
+    </w:p>
+    <w:p>
+      <w:r>
+        <w:t>El primer paso al adoptar la metodología SCRUM fue el definir roles, tareas y plazos para la realización y entrega de cada una de las tareas generadas a lo largo del proyecto. Para modelar esta organización representamos los plazos de cada tarea y cada sprint con la ayuda del diagrama de Gantt; en este diagrama cada tarea es representada con una grafica en el eje vertical, donde se determina su tiempo de duración en un cronograma hacia el eje horizontal.</w:t>
+      </w:r>
+    </w:p>
+    <w:p>
+      <w:r>
+        <w:drawing>
+          <wp:inline distT="0" distB="0" distL="0" distR="0" wp14:anchorId="0C9E8E53" wp14:editId="2C6BBA92">
+            <wp:extent cx="5759450" cy="4427220"/>
+            <wp:effectExtent l="0" t="0" r="0" b="0"/>
+            <wp:docPr id="246111230" name="Imagen 1"/>
+            <wp:cNvGraphicFramePr>
+              <a:graphicFrameLocks xmlns:a="http://schemas.openxmlformats.org/drawingml/2006/main" noChangeAspect="1"/>
+            </wp:cNvGraphicFramePr>
+            <a:graphic xmlns:a="http://schemas.openxmlformats.org/drawingml/2006/main">
+              <a:graphicData uri="http://schemas.openxmlformats.org/drawingml/2006/picture">
+                <pic:pic xmlns:pic="http://schemas.openxmlformats.org/drawingml/2006/picture">
+                  <pic:nvPicPr>
+                    <pic:cNvPr id="246111230" name=""/>
+                    <pic:cNvPicPr/>
+                  </pic:nvPicPr>
+                  <pic:blipFill>
+                    <a:blip r:embed="rId14"/>
+                    <a:stretch>
+                      <a:fillRect/>
+                    </a:stretch>
+                  </pic:blipFill>
+                  <pic:spPr>
+                    <a:xfrm>
+                      <a:off x="0" y="0"/>
+                      <a:ext cx="5759450" cy="4427220"/>
+                    </a:xfrm>
+                    <a:prstGeom prst="rect">
+                      <a:avLst/>
+                    </a:prstGeom>
+                  </pic:spPr>
+                </pic:pic>
+              </a:graphicData>
+            </a:graphic>
+          </wp:inline>
+        </w:drawing>
+      </w:r>
+    </w:p>
+    <w:p>
+      <w:pPr>
+        <w:rPr>
+          <w:u w:val="single"/>
+        </w:rPr>
+      </w:pPr>
+      <w:r>
+        <w:t>En el diagrama se represento cada sprint con un color</w:t>
+      </w:r>
+      <w:r>
+        <w:t xml:space="preserve"> diferente como ayuda visual a la hora de saber que tareas (graficas en color azul) se desprenden directamente de ese sprint</w:t>
+      </w:r>
+    </w:p>
+    <w:p>
+      <w:pPr>
+        <w:rPr>
+          <w:u w:val="single"/>
+        </w:rPr>
+      </w:pPr>
+    </w:p>
+    <w:p>
+      <w:pPr>
+        <w:rPr>
+          <w:u w:val="single"/>
+        </w:rPr>
+      </w:pPr>
+    </w:p>
+    <w:p>
       <w:r>
         <w:t xml:space="preserve"> </w:t>
-      </w:r>
-      <w:proofErr w:type="spellStart"/>
-      <w:r>
-        <w:t>Burndown</w:t>
-      </w:r>
-      <w:proofErr w:type="spellEnd"/>
-      <w:r>
-        <w:t xml:space="preserve"> chart, y </w:t>
-      </w:r>
-      <w:r>
-        <w:t>añadir</w:t>
-      </w:r>
-      <w:r>
-        <w:t xml:space="preserve"> </w:t>
-      </w:r>
-      <w:r>
-        <w:t xml:space="preserve">un enlace a Git y </w:t>
-      </w:r>
-      <w:r>
-        <w:t>una imagen del tablero Trello</w:t>
-      </w:r>
-      <w:r>
-        <w:t xml:space="preserve"> al final del proyecto</w:t>
-      </w:r>
-      <w:r>
-        <w:t xml:space="preserve"> (</w:t>
-      </w:r>
-      <w:r>
-        <w:t>junto al</w:t>
-      </w:r>
-      <w:r>
-        <w:t xml:space="preserve"> enlace). Cómo se ha coordinado el equipo para poder finalizar el trabajo.</w:t>
-      </w:r>
-      <w:r>
-        <w:t xml:space="preserve"> Aportación realizada por cada estudiante.</w:t>
       </w:r>
     </w:p>
     <w:p>
@@ -2242,11 +2590,12 @@
           <w:numId w:val="1"/>
         </w:numPr>
       </w:pPr>
-      <w:bookmarkStart w:id="8" w:name="_Toc224148680"/>
-      <w:r>
+      <w:bookmarkStart w:id="9" w:name="_Toc224148680"/>
+      <w:r>
+        <w:lastRenderedPageBreak/>
         <w:t>Resultados y conclusiones</w:t>
       </w:r>
-      <w:bookmarkEnd w:id="8"/>
+      <w:bookmarkEnd w:id="9"/>
     </w:p>
     <w:p>
       <w:r>
@@ -2276,11 +2625,11 @@
           <w:numId w:val="1"/>
         </w:numPr>
       </w:pPr>
-      <w:bookmarkStart w:id="9" w:name="_Toc224148681"/>
+      <w:bookmarkStart w:id="10" w:name="_Toc224148681"/>
       <w:r>
         <w:t>Trabajos futuros</w:t>
       </w:r>
-      <w:bookmarkEnd w:id="9"/>
+      <w:bookmarkEnd w:id="10"/>
     </w:p>
     <w:p>
       <w:r>
@@ -2317,18 +2666,18 @@
       <w:pPr>
         <w:pStyle w:val="Ttulo1"/>
       </w:pPr>
-      <w:bookmarkStart w:id="10" w:name="_Toc224148682"/>
+      <w:bookmarkStart w:id="11" w:name="_Toc224148682"/>
       <w:r>
         <w:lastRenderedPageBreak/>
         <w:t>Anexos</w:t>
       </w:r>
-      <w:bookmarkEnd w:id="10"/>
+      <w:bookmarkStart w:id="12" w:name="_Toc224148683"/>
+      <w:bookmarkEnd w:id="11"/>
     </w:p>
     <w:p>
       <w:pPr>
         <w:pStyle w:val="Ttulo1"/>
       </w:pPr>
-      <w:bookmarkStart w:id="11" w:name="_Toc224148683"/>
       <w:r>
         <w:rPr>
           <w:sz w:val="24"/>
@@ -2359,11 +2708,216 @@
         </w:rPr>
         <w:t>aplicación</w:t>
       </w:r>
-      <w:bookmarkEnd w:id="11"/>
-    </w:p>
-    <w:p>
-      <w:r>
-        <w:t>Incluir el listado de requisitos de programación y BD necesarios para garantizar el correcto funcionamiento de la aplicación.</w:t>
+      <w:bookmarkEnd w:id="12"/>
+    </w:p>
+    <w:p>
+      <w:r>
+        <w:t xml:space="preserve">Para la óptima ejecución de la aplicación, se definieron los siguientes requisitos mínimos, los cuales </w:t>
+      </w:r>
+      <w:r>
+        <w:t xml:space="preserve">son </w:t>
+      </w:r>
+      <w:r>
+        <w:t>necesarios para garantizar su correcto funcionamiento.</w:t>
+      </w:r>
+    </w:p>
+    <w:p>
+      <w:pPr>
+        <w:rPr>
+          <w:b/>
+          <w:bCs/>
+        </w:rPr>
+      </w:pPr>
+      <w:r>
+        <w:rPr>
+          <w:b/>
+          <w:bCs/>
+        </w:rPr>
+        <w:t>Requisitos de Hardware</w:t>
+      </w:r>
+    </w:p>
+    <w:p>
+      <w:r>
+        <w:t>Se r</w:t>
+      </w:r>
+      <w:r>
+        <w:t>ecomienda</w:t>
+      </w:r>
+      <w:r>
+        <w:t xml:space="preserve"> un equipo estándar con capacidad para ejecutar entornos gráficos basados en ventanas y soportar </w:t>
+      </w:r>
+      <w:r>
+        <w:t>el funcionamiento simultáneo</w:t>
+      </w:r>
+      <w:r>
+        <w:t xml:space="preserve"> de los componentes de</w:t>
+      </w:r>
+      <w:r>
+        <w:t xml:space="preserve"> la </w:t>
+      </w:r>
+      <w:proofErr w:type="spellStart"/>
+      <w:r>
+        <w:t>aplicacion</w:t>
+      </w:r>
+      <w:proofErr w:type="spellEnd"/>
+      <w:r>
+        <w:t>. Las especificaciones mínimas establecidas fueron:</w:t>
+      </w:r>
+    </w:p>
+    <w:p>
+      <w:pPr>
+        <w:pStyle w:val="Prrafodelista"/>
+        <w:numPr>
+          <w:ilvl w:val="0"/>
+          <w:numId w:val="13"/>
+        </w:numPr>
+      </w:pPr>
+      <w:r>
+        <w:t>Procesador: Intel Core i</w:t>
+      </w:r>
+      <w:r>
+        <w:t>5</w:t>
+      </w:r>
+      <w:r>
+        <w:t xml:space="preserve"> o AMD Ryzen </w:t>
+      </w:r>
+      <w:r>
+        <w:t>5</w:t>
+      </w:r>
+      <w:r>
+        <w:t>, con una frecuencia de 2.0 GHz o superior.</w:t>
+      </w:r>
+    </w:p>
+    <w:p>
+      <w:pPr>
+        <w:pStyle w:val="Prrafodelista"/>
+        <w:numPr>
+          <w:ilvl w:val="0"/>
+          <w:numId w:val="13"/>
+        </w:numPr>
+      </w:pPr>
+      <w:r>
+        <w:t>Memoria RAM: 4 GB como mínimo, recomendándose 8 GB para un rendimiento óptimo durante la ejecución concurrente de la aplicación y el servidor de base de datos.</w:t>
+      </w:r>
+    </w:p>
+    <w:p>
+      <w:pPr>
+        <w:pStyle w:val="Prrafodelista"/>
+        <w:numPr>
+          <w:ilvl w:val="0"/>
+          <w:numId w:val="13"/>
+        </w:numPr>
+      </w:pPr>
+      <w:r>
+        <w:t xml:space="preserve">Almacenamiento: </w:t>
+      </w:r>
+      <w:r>
+        <w:t>5 GB</w:t>
+      </w:r>
+      <w:r>
+        <w:t xml:space="preserve"> de espacio libre disponible para la instalación de la aplicación, sus dependencias y los archivos generados durante su ejecución.</w:t>
+      </w:r>
+    </w:p>
+    <w:p>
+      <w:pPr>
+        <w:pStyle w:val="Prrafodelista"/>
+        <w:numPr>
+          <w:ilvl w:val="0"/>
+          <w:numId w:val="13"/>
+        </w:numPr>
+      </w:pPr>
+      <w:r>
+        <w:t>Sistema operativo: Windows 10 o superior, macOS, o cualquier distribución Linux con soporte para entornos gráficos de escritorio.</w:t>
+      </w:r>
+    </w:p>
+    <w:p>
+      <w:pPr>
+        <w:rPr>
+          <w:b/>
+          <w:bCs/>
+        </w:rPr>
+      </w:pPr>
+      <w:r>
+        <w:rPr>
+          <w:b/>
+          <w:bCs/>
+        </w:rPr>
+        <w:t>Requisitos de Software</w:t>
+      </w:r>
+    </w:p>
+    <w:p>
+      <w:r>
+        <w:t>Se definieron los siguientes componentes de software como necesarios para el despliegue y funcionamiento de la aplicación:</w:t>
+      </w:r>
+    </w:p>
+    <w:p>
+      <w:pPr>
+        <w:numPr>
+          <w:ilvl w:val="0"/>
+          <w:numId w:val="14"/>
+        </w:numPr>
+      </w:pPr>
+      <w:r>
+        <w:t>Entorno de ejecución Java: Dado que la aplicación fue desarrollada en Java, se estableció como requisito indispensable contar con</w:t>
+      </w:r>
+      <w:r>
+        <w:t xml:space="preserve"> el</w:t>
+      </w:r>
+      <w:r>
+        <w:t xml:space="preserve"> Java </w:t>
+      </w:r>
+      <w:proofErr w:type="spellStart"/>
+      <w:r>
+        <w:t>Runtime</w:t>
+      </w:r>
+      <w:proofErr w:type="spellEnd"/>
+      <w:r>
+        <w:t xml:space="preserve"> </w:t>
+      </w:r>
+      <w:proofErr w:type="spellStart"/>
+      <w:r>
+        <w:t>Environment</w:t>
+      </w:r>
+      <w:proofErr w:type="spellEnd"/>
+      <w:r>
+        <w:t xml:space="preserve"> (JRE) versión 21 o, en su defecto, el Java </w:t>
+      </w:r>
+      <w:proofErr w:type="spellStart"/>
+      <w:r>
+        <w:t>Development</w:t>
+      </w:r>
+      <w:proofErr w:type="spellEnd"/>
+      <w:r>
+        <w:t xml:space="preserve"> Kit (JDK) 21, el cual incluye el entorno de ejecución.</w:t>
+      </w:r>
+    </w:p>
+    <w:p>
+      <w:pPr>
+        <w:numPr>
+          <w:ilvl w:val="0"/>
+          <w:numId w:val="14"/>
+        </w:numPr>
+      </w:pPr>
+      <w:r>
+        <w:t>Servidor de base de datos: La aplicación requi</w:t>
+      </w:r>
+      <w:r>
+        <w:t>ere</w:t>
+      </w:r>
+      <w:r>
+        <w:t xml:space="preserve"> conectarse a un sistema gestor de bases de datos relacional para la persistencia de la información relacionada con citas, clientes, talleres y empleados. Para ello, se utilizó MySQL Server, el cual debió estar instalado y en ejecución en el equipo local o en un servidor accesible desde la aplicación. Se requirió que el servicio est</w:t>
+      </w:r>
+      <w:r>
+        <w:t>e</w:t>
+      </w:r>
+      <w:r>
+        <w:t xml:space="preserve"> activo y que se c</w:t>
+      </w:r>
+      <w:r>
+        <w:t xml:space="preserve">uente </w:t>
+      </w:r>
+      <w:r>
+        <w:t>con las credenciales de acceso adecuadas para la conexión.</w:t>
       </w:r>
     </w:p>
     <w:p>
@@ -2373,11 +2927,12 @@
           <w:sz w:val="24"/>
         </w:rPr>
       </w:pPr>
-      <w:bookmarkStart w:id="12" w:name="_Toc224148684"/>
+      <w:bookmarkStart w:id="13" w:name="_Toc224148684"/>
       <w:r>
         <w:rPr>
           <w:sz w:val="24"/>
         </w:rPr>
+        <w:lastRenderedPageBreak/>
         <w:t>Anexo II</w:t>
       </w:r>
       <w:r>
@@ -2392,7 +2947,7 @@
         </w:rPr>
         <w:t>o de la aplicación</w:t>
       </w:r>
-      <w:bookmarkEnd w:id="12"/>
+      <w:bookmarkEnd w:id="13"/>
     </w:p>
     <w:p>
       <w:r>
@@ -2414,7 +2969,7 @@
       <w:pPr>
         <w:pStyle w:val="Ttulo1"/>
       </w:pPr>
-      <w:bookmarkStart w:id="13" w:name="_Toc224148685"/>
+      <w:bookmarkStart w:id="14" w:name="_Toc224148685"/>
       <w:r>
         <w:rPr>
           <w:sz w:val="24"/>
@@ -2427,7 +2982,7 @@
         </w:rPr>
         <w:t>III</w:t>
       </w:r>
-      <w:bookmarkEnd w:id="13"/>
+      <w:bookmarkEnd w:id="14"/>
     </w:p>
     <w:p>
       <w:r>
@@ -2507,8 +3062,8 @@
     </w:p>
     <w:p/>
     <w:sectPr>
-      <w:headerReference w:type="default" r:id="rId10"/>
-      <w:footerReference w:type="default" r:id="rId11"/>
+      <w:headerReference w:type="default" r:id="rId15"/>
+      <w:footerReference w:type="default" r:id="rId16"/>
       <w:pgSz w:w="11906" w:h="16838"/>
       <w:pgMar w:top="1418" w:right="1418" w:bottom="1418" w:left="1418" w:header="709" w:footer="709" w:gutter="0"/>
       <w:pgNumType w:start="0"/>
@@ -3013,6 +3568,495 @@
     </w:lvl>
   </w:abstractNum>
   <w:abstractNum w:abstractNumId="3" w15:restartNumberingAfterBreak="0">
+    <w:nsid w:val="2CA16704"/>
+    <w:multiLevelType w:val="multilevel"/>
+    <w:tmpl w:val="ADD40D7C"/>
+    <w:lvl w:ilvl="0">
+      <w:start w:val="1"/>
+      <w:numFmt w:val="bullet"/>
+      <w:lvlText w:val=""/>
+      <w:lvlJc w:val="left"/>
+      <w:pPr>
+        <w:tabs>
+          <w:tab w:val="num" w:pos="720"/>
+        </w:tabs>
+        <w:ind w:left="720" w:hanging="360"/>
+      </w:pPr>
+      <w:rPr>
+        <w:rFonts w:ascii="Symbol" w:hAnsi="Symbol" w:hint="default"/>
+        <w:sz w:val="20"/>
+      </w:rPr>
+    </w:lvl>
+    <w:lvl w:ilvl="1" w:tentative="1">
+      <w:start w:val="1"/>
+      <w:numFmt w:val="bullet"/>
+      <w:lvlText w:val="o"/>
+      <w:lvlJc w:val="left"/>
+      <w:pPr>
+        <w:tabs>
+          <w:tab w:val="num" w:pos="1440"/>
+        </w:tabs>
+        <w:ind w:left="1440" w:hanging="360"/>
+      </w:pPr>
+      <w:rPr>
+        <w:rFonts w:ascii="Courier New" w:hAnsi="Courier New" w:hint="default"/>
+        <w:sz w:val="20"/>
+      </w:rPr>
+    </w:lvl>
+    <w:lvl w:ilvl="2" w:tentative="1">
+      <w:start w:val="1"/>
+      <w:numFmt w:val="bullet"/>
+      <w:lvlText w:val=""/>
+      <w:lvlJc w:val="left"/>
+      <w:pPr>
+        <w:tabs>
+          <w:tab w:val="num" w:pos="2160"/>
+        </w:tabs>
+        <w:ind w:left="2160" w:hanging="360"/>
+      </w:pPr>
+      <w:rPr>
+        <w:rFonts w:ascii="Wingdings" w:hAnsi="Wingdings" w:hint="default"/>
+        <w:sz w:val="20"/>
+      </w:rPr>
+    </w:lvl>
+    <w:lvl w:ilvl="3" w:tentative="1">
+      <w:start w:val="1"/>
+      <w:numFmt w:val="bullet"/>
+      <w:lvlText w:val=""/>
+      <w:lvlJc w:val="left"/>
+      <w:pPr>
+        <w:tabs>
+          <w:tab w:val="num" w:pos="2880"/>
+        </w:tabs>
+        <w:ind w:left="2880" w:hanging="360"/>
+      </w:pPr>
+      <w:rPr>
+        <w:rFonts w:ascii="Wingdings" w:hAnsi="Wingdings" w:hint="default"/>
+        <w:sz w:val="20"/>
+      </w:rPr>
+    </w:lvl>
+    <w:lvl w:ilvl="4" w:tentative="1">
+      <w:start w:val="1"/>
+      <w:numFmt w:val="bullet"/>
+      <w:lvlText w:val=""/>
+      <w:lvlJc w:val="left"/>
+      <w:pPr>
+        <w:tabs>
+          <w:tab w:val="num" w:pos="3600"/>
+        </w:tabs>
+        <w:ind w:left="3600" w:hanging="360"/>
+      </w:pPr>
+      <w:rPr>
+        <w:rFonts w:ascii="Wingdings" w:hAnsi="Wingdings" w:hint="default"/>
+        <w:sz w:val="20"/>
+      </w:rPr>
+    </w:lvl>
+    <w:lvl w:ilvl="5" w:tentative="1">
+      <w:start w:val="1"/>
+      <w:numFmt w:val="bullet"/>
+      <w:lvlText w:val=""/>
+      <w:lvlJc w:val="left"/>
+      <w:pPr>
+        <w:tabs>
+          <w:tab w:val="num" w:pos="4320"/>
+        </w:tabs>
+        <w:ind w:left="4320" w:hanging="360"/>
+      </w:pPr>
+      <w:rPr>
+        <w:rFonts w:ascii="Wingdings" w:hAnsi="Wingdings" w:hint="default"/>
+        <w:sz w:val="20"/>
+      </w:rPr>
+    </w:lvl>
+    <w:lvl w:ilvl="6" w:tentative="1">
+      <w:start w:val="1"/>
+      <w:numFmt w:val="bullet"/>
+      <w:lvlText w:val=""/>
+      <w:lvlJc w:val="left"/>
+      <w:pPr>
+        <w:tabs>
+          <w:tab w:val="num" w:pos="5040"/>
+        </w:tabs>
+        <w:ind w:left="5040" w:hanging="360"/>
+      </w:pPr>
+      <w:rPr>
+        <w:rFonts w:ascii="Wingdings" w:hAnsi="Wingdings" w:hint="default"/>
+        <w:sz w:val="20"/>
+      </w:rPr>
+    </w:lvl>
+    <w:lvl w:ilvl="7" w:tentative="1">
+      <w:start w:val="1"/>
+      <w:numFmt w:val="bullet"/>
+      <w:lvlText w:val=""/>
+      <w:lvlJc w:val="left"/>
+      <w:pPr>
+        <w:tabs>
+          <w:tab w:val="num" w:pos="5760"/>
+        </w:tabs>
+        <w:ind w:left="5760" w:hanging="360"/>
+      </w:pPr>
+      <w:rPr>
+        <w:rFonts w:ascii="Wingdings" w:hAnsi="Wingdings" w:hint="default"/>
+        <w:sz w:val="20"/>
+      </w:rPr>
+    </w:lvl>
+    <w:lvl w:ilvl="8" w:tentative="1">
+      <w:start w:val="1"/>
+      <w:numFmt w:val="bullet"/>
+      <w:lvlText w:val=""/>
+      <w:lvlJc w:val="left"/>
+      <w:pPr>
+        <w:tabs>
+          <w:tab w:val="num" w:pos="6480"/>
+        </w:tabs>
+        <w:ind w:left="6480" w:hanging="360"/>
+      </w:pPr>
+      <w:rPr>
+        <w:rFonts w:ascii="Wingdings" w:hAnsi="Wingdings" w:hint="default"/>
+        <w:sz w:val="20"/>
+      </w:rPr>
+    </w:lvl>
+  </w:abstractNum>
+  <w:abstractNum w:abstractNumId="4" w15:restartNumberingAfterBreak="0">
+    <w:nsid w:val="2E6067DB"/>
+    <w:multiLevelType w:val="multilevel"/>
+    <w:tmpl w:val="1F2E6E1C"/>
+    <w:lvl w:ilvl="0">
+      <w:start w:val="1"/>
+      <w:numFmt w:val="bullet"/>
+      <w:lvlText w:val="●"/>
+      <w:lvlJc w:val="left"/>
+      <w:pPr>
+        <w:ind w:left="720" w:hanging="360"/>
+      </w:pPr>
+      <w:rPr>
+        <w:u w:val="none"/>
+      </w:rPr>
+    </w:lvl>
+    <w:lvl w:ilvl="1">
+      <w:start w:val="1"/>
+      <w:numFmt w:val="bullet"/>
+      <w:lvlText w:val="○"/>
+      <w:lvlJc w:val="left"/>
+      <w:pPr>
+        <w:ind w:left="1440" w:hanging="360"/>
+      </w:pPr>
+      <w:rPr>
+        <w:u w:val="none"/>
+      </w:rPr>
+    </w:lvl>
+    <w:lvl w:ilvl="2">
+      <w:start w:val="1"/>
+      <w:numFmt w:val="bullet"/>
+      <w:lvlText w:val="■"/>
+      <w:lvlJc w:val="left"/>
+      <w:pPr>
+        <w:ind w:left="2160" w:hanging="360"/>
+      </w:pPr>
+      <w:rPr>
+        <w:u w:val="none"/>
+      </w:rPr>
+    </w:lvl>
+    <w:lvl w:ilvl="3">
+      <w:start w:val="1"/>
+      <w:numFmt w:val="bullet"/>
+      <w:lvlText w:val="●"/>
+      <w:lvlJc w:val="left"/>
+      <w:pPr>
+        <w:ind w:left="2880" w:hanging="360"/>
+      </w:pPr>
+      <w:rPr>
+        <w:u w:val="none"/>
+      </w:rPr>
+    </w:lvl>
+    <w:lvl w:ilvl="4">
+      <w:start w:val="1"/>
+      <w:numFmt w:val="bullet"/>
+      <w:lvlText w:val="○"/>
+      <w:lvlJc w:val="left"/>
+      <w:pPr>
+        <w:ind w:left="3600" w:hanging="360"/>
+      </w:pPr>
+      <w:rPr>
+        <w:u w:val="none"/>
+      </w:rPr>
+    </w:lvl>
+    <w:lvl w:ilvl="5">
+      <w:start w:val="1"/>
+      <w:numFmt w:val="bullet"/>
+      <w:lvlText w:val="■"/>
+      <w:lvlJc w:val="left"/>
+      <w:pPr>
+        <w:ind w:left="4320" w:hanging="360"/>
+      </w:pPr>
+      <w:rPr>
+        <w:u w:val="none"/>
+      </w:rPr>
+    </w:lvl>
+    <w:lvl w:ilvl="6">
+      <w:start w:val="1"/>
+      <w:numFmt w:val="bullet"/>
+      <w:lvlText w:val="●"/>
+      <w:lvlJc w:val="left"/>
+      <w:pPr>
+        <w:ind w:left="5040" w:hanging="360"/>
+      </w:pPr>
+      <w:rPr>
+        <w:u w:val="none"/>
+      </w:rPr>
+    </w:lvl>
+    <w:lvl w:ilvl="7">
+      <w:start w:val="1"/>
+      <w:numFmt w:val="bullet"/>
+      <w:lvlText w:val="○"/>
+      <w:lvlJc w:val="left"/>
+      <w:pPr>
+        <w:ind w:left="5760" w:hanging="360"/>
+      </w:pPr>
+      <w:rPr>
+        <w:u w:val="none"/>
+      </w:rPr>
+    </w:lvl>
+    <w:lvl w:ilvl="8">
+      <w:start w:val="1"/>
+      <w:numFmt w:val="bullet"/>
+      <w:lvlText w:val="■"/>
+      <w:lvlJc w:val="left"/>
+      <w:pPr>
+        <w:ind w:left="6480" w:hanging="360"/>
+      </w:pPr>
+      <w:rPr>
+        <w:u w:val="none"/>
+      </w:rPr>
+    </w:lvl>
+  </w:abstractNum>
+  <w:abstractNum w:abstractNumId="5" w15:restartNumberingAfterBreak="0">
+    <w:nsid w:val="3B2A048C"/>
+    <w:multiLevelType w:val="multilevel"/>
+    <w:tmpl w:val="559A8E84"/>
+    <w:lvl w:ilvl="0">
+      <w:start w:val="1"/>
+      <w:numFmt w:val="bullet"/>
+      <w:lvlText w:val="●"/>
+      <w:lvlJc w:val="left"/>
+      <w:pPr>
+        <w:ind w:left="720" w:hanging="360"/>
+      </w:pPr>
+      <w:rPr>
+        <w:u w:val="none"/>
+      </w:rPr>
+    </w:lvl>
+    <w:lvl w:ilvl="1">
+      <w:start w:val="1"/>
+      <w:numFmt w:val="bullet"/>
+      <w:lvlText w:val="○"/>
+      <w:lvlJc w:val="left"/>
+      <w:pPr>
+        <w:ind w:left="1440" w:hanging="360"/>
+      </w:pPr>
+      <w:rPr>
+        <w:u w:val="none"/>
+      </w:rPr>
+    </w:lvl>
+    <w:lvl w:ilvl="2">
+      <w:start w:val="1"/>
+      <w:numFmt w:val="bullet"/>
+      <w:lvlText w:val="■"/>
+      <w:lvlJc w:val="left"/>
+      <w:pPr>
+        <w:ind w:left="2160" w:hanging="360"/>
+      </w:pPr>
+      <w:rPr>
+        <w:u w:val="none"/>
+      </w:rPr>
+    </w:lvl>
+    <w:lvl w:ilvl="3">
+      <w:start w:val="1"/>
+      <w:numFmt w:val="bullet"/>
+      <w:lvlText w:val="●"/>
+      <w:lvlJc w:val="left"/>
+      <w:pPr>
+        <w:ind w:left="2880" w:hanging="360"/>
+      </w:pPr>
+      <w:rPr>
+        <w:u w:val="none"/>
+      </w:rPr>
+    </w:lvl>
+    <w:lvl w:ilvl="4">
+      <w:start w:val="1"/>
+      <w:numFmt w:val="bullet"/>
+      <w:lvlText w:val="○"/>
+      <w:lvlJc w:val="left"/>
+      <w:pPr>
+        <w:ind w:left="3600" w:hanging="360"/>
+      </w:pPr>
+      <w:rPr>
+        <w:u w:val="none"/>
+      </w:rPr>
+    </w:lvl>
+    <w:lvl w:ilvl="5">
+      <w:start w:val="1"/>
+      <w:numFmt w:val="bullet"/>
+      <w:lvlText w:val="■"/>
+      <w:lvlJc w:val="left"/>
+      <w:pPr>
+        <w:ind w:left="4320" w:hanging="360"/>
+      </w:pPr>
+      <w:rPr>
+        <w:u w:val="none"/>
+      </w:rPr>
+    </w:lvl>
+    <w:lvl w:ilvl="6">
+      <w:start w:val="1"/>
+      <w:numFmt w:val="bullet"/>
+      <w:lvlText w:val="●"/>
+      <w:lvlJc w:val="left"/>
+      <w:pPr>
+        <w:ind w:left="5040" w:hanging="360"/>
+      </w:pPr>
+      <w:rPr>
+        <w:u w:val="none"/>
+      </w:rPr>
+    </w:lvl>
+    <w:lvl w:ilvl="7">
+      <w:start w:val="1"/>
+      <w:numFmt w:val="bullet"/>
+      <w:lvlText w:val="○"/>
+      <w:lvlJc w:val="left"/>
+      <w:pPr>
+        <w:ind w:left="5760" w:hanging="360"/>
+      </w:pPr>
+      <w:rPr>
+        <w:u w:val="none"/>
+      </w:rPr>
+    </w:lvl>
+    <w:lvl w:ilvl="8">
+      <w:start w:val="1"/>
+      <w:numFmt w:val="bullet"/>
+      <w:lvlText w:val="■"/>
+      <w:lvlJc w:val="left"/>
+      <w:pPr>
+        <w:ind w:left="6480" w:hanging="360"/>
+      </w:pPr>
+      <w:rPr>
+        <w:u w:val="none"/>
+      </w:rPr>
+    </w:lvl>
+  </w:abstractNum>
+  <w:abstractNum w:abstractNumId="6" w15:restartNumberingAfterBreak="0">
+    <w:nsid w:val="48CA2915"/>
+    <w:multiLevelType w:val="multilevel"/>
+    <w:tmpl w:val="705CFF0A"/>
+    <w:lvl w:ilvl="0">
+      <w:start w:val="1"/>
+      <w:numFmt w:val="bullet"/>
+      <w:lvlText w:val="●"/>
+      <w:lvlJc w:val="left"/>
+      <w:pPr>
+        <w:ind w:left="720" w:hanging="360"/>
+      </w:pPr>
+      <w:rPr>
+        <w:rFonts w:ascii="Arial" w:eastAsia="Arial" w:hAnsi="Arial" w:cs="Arial"/>
+        <w:u w:val="none"/>
+      </w:rPr>
+    </w:lvl>
+    <w:lvl w:ilvl="1">
+      <w:start w:val="1"/>
+      <w:numFmt w:val="bullet"/>
+      <w:lvlText w:val="○"/>
+      <w:lvlJc w:val="left"/>
+      <w:pPr>
+        <w:ind w:left="1440" w:hanging="360"/>
+      </w:pPr>
+      <w:rPr>
+        <w:u w:val="none"/>
+      </w:rPr>
+    </w:lvl>
+    <w:lvl w:ilvl="2">
+      <w:start w:val="1"/>
+      <w:numFmt w:val="bullet"/>
+      <w:lvlText w:val="■"/>
+      <w:lvlJc w:val="left"/>
+      <w:pPr>
+        <w:ind w:left="2160" w:hanging="360"/>
+      </w:pPr>
+      <w:rPr>
+        <w:u w:val="none"/>
+      </w:rPr>
+    </w:lvl>
+    <w:lvl w:ilvl="3">
+      <w:start w:val="1"/>
+      <w:numFmt w:val="bullet"/>
+      <w:lvlText w:val="●"/>
+      <w:lvlJc w:val="left"/>
+      <w:pPr>
+        <w:ind w:left="2880" w:hanging="360"/>
+      </w:pPr>
+      <w:rPr>
+        <w:u w:val="none"/>
+      </w:rPr>
+    </w:lvl>
+    <w:lvl w:ilvl="4">
+      <w:start w:val="1"/>
+      <w:numFmt w:val="bullet"/>
+      <w:lvlText w:val="○"/>
+      <w:lvlJc w:val="left"/>
+      <w:pPr>
+        <w:ind w:left="3600" w:hanging="360"/>
+      </w:pPr>
+      <w:rPr>
+        <w:u w:val="none"/>
+      </w:rPr>
+    </w:lvl>
+    <w:lvl w:ilvl="5">
+      <w:start w:val="1"/>
+      <w:numFmt w:val="bullet"/>
+      <w:lvlText w:val="■"/>
+      <w:lvlJc w:val="left"/>
+      <w:pPr>
+        <w:ind w:left="4320" w:hanging="360"/>
+      </w:pPr>
+      <w:rPr>
+        <w:u w:val="none"/>
+      </w:rPr>
+    </w:lvl>
+    <w:lvl w:ilvl="6">
+      <w:start w:val="1"/>
+      <w:numFmt w:val="bullet"/>
+      <w:lvlText w:val="●"/>
+      <w:lvlJc w:val="left"/>
+      <w:pPr>
+        <w:ind w:left="5040" w:hanging="360"/>
+      </w:pPr>
+      <w:rPr>
+        <w:u w:val="none"/>
+      </w:rPr>
+    </w:lvl>
+    <w:lvl w:ilvl="7">
+      <w:start w:val="1"/>
+      <w:numFmt w:val="bullet"/>
+      <w:lvlText w:val="○"/>
+      <w:lvlJc w:val="left"/>
+      <w:pPr>
+        <w:ind w:left="5760" w:hanging="360"/>
+      </w:pPr>
+      <w:rPr>
+        <w:u w:val="none"/>
+      </w:rPr>
+    </w:lvl>
+    <w:lvl w:ilvl="8">
+      <w:start w:val="1"/>
+      <w:numFmt w:val="bullet"/>
+      <w:lvlText w:val="■"/>
+      <w:lvlJc w:val="left"/>
+      <w:pPr>
+        <w:ind w:left="6480" w:hanging="360"/>
+      </w:pPr>
+      <w:rPr>
+        <w:u w:val="none"/>
+      </w:rPr>
+    </w:lvl>
+  </w:abstractNum>
+  <w:abstractNum w:abstractNumId="7" w15:restartNumberingAfterBreak="0">
     <w:nsid w:val="4BA54E9E"/>
     <w:multiLevelType w:val="multilevel"/>
     <w:tmpl w:val="AD869448"/>
@@ -3125,7 +4169,382 @@
       </w:pPr>
     </w:lvl>
   </w:abstractNum>
-  <w:abstractNum w:abstractNumId="4" w15:restartNumberingAfterBreak="0">
+  <w:abstractNum w:abstractNumId="8" w15:restartNumberingAfterBreak="0">
+    <w:nsid w:val="54A50B1C"/>
+    <w:multiLevelType w:val="multilevel"/>
+    <w:tmpl w:val="C270BDB2"/>
+    <w:lvl w:ilvl="0">
+      <w:start w:val="1"/>
+      <w:numFmt w:val="bullet"/>
+      <w:lvlText w:val="●"/>
+      <w:lvlJc w:val="left"/>
+      <w:pPr>
+        <w:ind w:left="720" w:hanging="360"/>
+      </w:pPr>
+      <w:rPr>
+        <w:u w:val="none"/>
+      </w:rPr>
+    </w:lvl>
+    <w:lvl w:ilvl="1">
+      <w:start w:val="1"/>
+      <w:numFmt w:val="bullet"/>
+      <w:lvlText w:val="○"/>
+      <w:lvlJc w:val="left"/>
+      <w:pPr>
+        <w:ind w:left="1440" w:hanging="360"/>
+      </w:pPr>
+      <w:rPr>
+        <w:u w:val="none"/>
+      </w:rPr>
+    </w:lvl>
+    <w:lvl w:ilvl="2">
+      <w:start w:val="1"/>
+      <w:numFmt w:val="bullet"/>
+      <w:lvlText w:val="■"/>
+      <w:lvlJc w:val="left"/>
+      <w:pPr>
+        <w:ind w:left="2160" w:hanging="360"/>
+      </w:pPr>
+      <w:rPr>
+        <w:u w:val="none"/>
+      </w:rPr>
+    </w:lvl>
+    <w:lvl w:ilvl="3">
+      <w:start w:val="1"/>
+      <w:numFmt w:val="bullet"/>
+      <w:lvlText w:val="●"/>
+      <w:lvlJc w:val="left"/>
+      <w:pPr>
+        <w:ind w:left="2880" w:hanging="360"/>
+      </w:pPr>
+      <w:rPr>
+        <w:u w:val="none"/>
+      </w:rPr>
+    </w:lvl>
+    <w:lvl w:ilvl="4">
+      <w:start w:val="1"/>
+      <w:numFmt w:val="bullet"/>
+      <w:lvlText w:val="○"/>
+      <w:lvlJc w:val="left"/>
+      <w:pPr>
+        <w:ind w:left="3600" w:hanging="360"/>
+      </w:pPr>
+      <w:rPr>
+        <w:u w:val="none"/>
+      </w:rPr>
+    </w:lvl>
+    <w:lvl w:ilvl="5">
+      <w:start w:val="1"/>
+      <w:numFmt w:val="bullet"/>
+      <w:lvlText w:val="■"/>
+      <w:lvlJc w:val="left"/>
+      <w:pPr>
+        <w:ind w:left="4320" w:hanging="360"/>
+      </w:pPr>
+      <w:rPr>
+        <w:u w:val="none"/>
+      </w:rPr>
+    </w:lvl>
+    <w:lvl w:ilvl="6">
+      <w:start w:val="1"/>
+      <w:numFmt w:val="bullet"/>
+      <w:lvlText w:val="●"/>
+      <w:lvlJc w:val="left"/>
+      <w:pPr>
+        <w:ind w:left="5040" w:hanging="360"/>
+      </w:pPr>
+      <w:rPr>
+        <w:u w:val="none"/>
+      </w:rPr>
+    </w:lvl>
+    <w:lvl w:ilvl="7">
+      <w:start w:val="1"/>
+      <w:numFmt w:val="bullet"/>
+      <w:lvlText w:val="○"/>
+      <w:lvlJc w:val="left"/>
+      <w:pPr>
+        <w:ind w:left="5760" w:hanging="360"/>
+      </w:pPr>
+      <w:rPr>
+        <w:u w:val="none"/>
+      </w:rPr>
+    </w:lvl>
+    <w:lvl w:ilvl="8">
+      <w:start w:val="1"/>
+      <w:numFmt w:val="bullet"/>
+      <w:lvlText w:val="■"/>
+      <w:lvlJc w:val="left"/>
+      <w:pPr>
+        <w:ind w:left="6480" w:hanging="360"/>
+      </w:pPr>
+      <w:rPr>
+        <w:u w:val="none"/>
+      </w:rPr>
+    </w:lvl>
+  </w:abstractNum>
+  <w:abstractNum w:abstractNumId="9" w15:restartNumberingAfterBreak="0">
+    <w:nsid w:val="58F321A0"/>
+    <w:multiLevelType w:val="multilevel"/>
+    <w:tmpl w:val="7B9EDB78"/>
+    <w:lvl w:ilvl="0">
+      <w:start w:val="1"/>
+      <w:numFmt w:val="bullet"/>
+      <w:lvlText w:val=""/>
+      <w:lvlJc w:val="left"/>
+      <w:pPr>
+        <w:tabs>
+          <w:tab w:val="num" w:pos="720"/>
+        </w:tabs>
+        <w:ind w:left="720" w:hanging="360"/>
+      </w:pPr>
+      <w:rPr>
+        <w:rFonts w:ascii="Symbol" w:hAnsi="Symbol" w:hint="default"/>
+        <w:sz w:val="20"/>
+      </w:rPr>
+    </w:lvl>
+    <w:lvl w:ilvl="1" w:tentative="1">
+      <w:start w:val="1"/>
+      <w:numFmt w:val="bullet"/>
+      <w:lvlText w:val="o"/>
+      <w:lvlJc w:val="left"/>
+      <w:pPr>
+        <w:tabs>
+          <w:tab w:val="num" w:pos="1440"/>
+        </w:tabs>
+        <w:ind w:left="1440" w:hanging="360"/>
+      </w:pPr>
+      <w:rPr>
+        <w:rFonts w:ascii="Courier New" w:hAnsi="Courier New" w:hint="default"/>
+        <w:sz w:val="20"/>
+      </w:rPr>
+    </w:lvl>
+    <w:lvl w:ilvl="2" w:tentative="1">
+      <w:start w:val="1"/>
+      <w:numFmt w:val="bullet"/>
+      <w:lvlText w:val=""/>
+      <w:lvlJc w:val="left"/>
+      <w:pPr>
+        <w:tabs>
+          <w:tab w:val="num" w:pos="2160"/>
+        </w:tabs>
+        <w:ind w:left="2160" w:hanging="360"/>
+      </w:pPr>
+      <w:rPr>
+        <w:rFonts w:ascii="Wingdings" w:hAnsi="Wingdings" w:hint="default"/>
+        <w:sz w:val="20"/>
+      </w:rPr>
+    </w:lvl>
+    <w:lvl w:ilvl="3" w:tentative="1">
+      <w:start w:val="1"/>
+      <w:numFmt w:val="bullet"/>
+      <w:lvlText w:val=""/>
+      <w:lvlJc w:val="left"/>
+      <w:pPr>
+        <w:tabs>
+          <w:tab w:val="num" w:pos="2880"/>
+        </w:tabs>
+        <w:ind w:left="2880" w:hanging="360"/>
+      </w:pPr>
+      <w:rPr>
+        <w:rFonts w:ascii="Wingdings" w:hAnsi="Wingdings" w:hint="default"/>
+        <w:sz w:val="20"/>
+      </w:rPr>
+    </w:lvl>
+    <w:lvl w:ilvl="4" w:tentative="1">
+      <w:start w:val="1"/>
+      <w:numFmt w:val="bullet"/>
+      <w:lvlText w:val=""/>
+      <w:lvlJc w:val="left"/>
+      <w:pPr>
+        <w:tabs>
+          <w:tab w:val="num" w:pos="3600"/>
+        </w:tabs>
+        <w:ind w:left="3600" w:hanging="360"/>
+      </w:pPr>
+      <w:rPr>
+        <w:rFonts w:ascii="Wingdings" w:hAnsi="Wingdings" w:hint="default"/>
+        <w:sz w:val="20"/>
+      </w:rPr>
+    </w:lvl>
+    <w:lvl w:ilvl="5" w:tentative="1">
+      <w:start w:val="1"/>
+      <w:numFmt w:val="bullet"/>
+      <w:lvlText w:val=""/>
+      <w:lvlJc w:val="left"/>
+      <w:pPr>
+        <w:tabs>
+          <w:tab w:val="num" w:pos="4320"/>
+        </w:tabs>
+        <w:ind w:left="4320" w:hanging="360"/>
+      </w:pPr>
+      <w:rPr>
+        <w:rFonts w:ascii="Wingdings" w:hAnsi="Wingdings" w:hint="default"/>
+        <w:sz w:val="20"/>
+      </w:rPr>
+    </w:lvl>
+    <w:lvl w:ilvl="6" w:tentative="1">
+      <w:start w:val="1"/>
+      <w:numFmt w:val="bullet"/>
+      <w:lvlText w:val=""/>
+      <w:lvlJc w:val="left"/>
+      <w:pPr>
+        <w:tabs>
+          <w:tab w:val="num" w:pos="5040"/>
+        </w:tabs>
+        <w:ind w:left="5040" w:hanging="360"/>
+      </w:pPr>
+      <w:rPr>
+        <w:rFonts w:ascii="Wingdings" w:hAnsi="Wingdings" w:hint="default"/>
+        <w:sz w:val="20"/>
+      </w:rPr>
+    </w:lvl>
+    <w:lvl w:ilvl="7" w:tentative="1">
+      <w:start w:val="1"/>
+      <w:numFmt w:val="bullet"/>
+      <w:lvlText w:val=""/>
+      <w:lvlJc w:val="left"/>
+      <w:pPr>
+        <w:tabs>
+          <w:tab w:val="num" w:pos="5760"/>
+        </w:tabs>
+        <w:ind w:left="5760" w:hanging="360"/>
+      </w:pPr>
+      <w:rPr>
+        <w:rFonts w:ascii="Wingdings" w:hAnsi="Wingdings" w:hint="default"/>
+        <w:sz w:val="20"/>
+      </w:rPr>
+    </w:lvl>
+    <w:lvl w:ilvl="8" w:tentative="1">
+      <w:start w:val="1"/>
+      <w:numFmt w:val="bullet"/>
+      <w:lvlText w:val=""/>
+      <w:lvlJc w:val="left"/>
+      <w:pPr>
+        <w:tabs>
+          <w:tab w:val="num" w:pos="6480"/>
+        </w:tabs>
+        <w:ind w:left="6480" w:hanging="360"/>
+      </w:pPr>
+      <w:rPr>
+        <w:rFonts w:ascii="Wingdings" w:hAnsi="Wingdings" w:hint="default"/>
+        <w:sz w:val="20"/>
+      </w:rPr>
+    </w:lvl>
+  </w:abstractNum>
+  <w:abstractNum w:abstractNumId="10" w15:restartNumberingAfterBreak="0">
+    <w:nsid w:val="67586EF5"/>
+    <w:multiLevelType w:val="hybridMultilevel"/>
+    <w:tmpl w:val="04A22B2A"/>
+    <w:lvl w:ilvl="0" w:tplc="0C0A0001">
+      <w:start w:val="1"/>
+      <w:numFmt w:val="bullet"/>
+      <w:lvlText w:val=""/>
+      <w:lvlJc w:val="left"/>
+      <w:pPr>
+        <w:ind w:left="720" w:hanging="360"/>
+      </w:pPr>
+      <w:rPr>
+        <w:rFonts w:ascii="Symbol" w:hAnsi="Symbol" w:hint="default"/>
+      </w:rPr>
+    </w:lvl>
+    <w:lvl w:ilvl="1" w:tplc="0C0A0003" w:tentative="1">
+      <w:start w:val="1"/>
+      <w:numFmt w:val="bullet"/>
+      <w:lvlText w:val="o"/>
+      <w:lvlJc w:val="left"/>
+      <w:pPr>
+        <w:ind w:left="1440" w:hanging="360"/>
+      </w:pPr>
+      <w:rPr>
+        <w:rFonts w:ascii="Courier New" w:hAnsi="Courier New" w:cs="Courier New" w:hint="default"/>
+      </w:rPr>
+    </w:lvl>
+    <w:lvl w:ilvl="2" w:tplc="0C0A0005" w:tentative="1">
+      <w:start w:val="1"/>
+      <w:numFmt w:val="bullet"/>
+      <w:lvlText w:val=""/>
+      <w:lvlJc w:val="left"/>
+      <w:pPr>
+        <w:ind w:left="2160" w:hanging="360"/>
+      </w:pPr>
+      <w:rPr>
+        <w:rFonts w:ascii="Wingdings" w:hAnsi="Wingdings" w:hint="default"/>
+      </w:rPr>
+    </w:lvl>
+    <w:lvl w:ilvl="3" w:tplc="0C0A0001" w:tentative="1">
+      <w:start w:val="1"/>
+      <w:numFmt w:val="bullet"/>
+      <w:lvlText w:val=""/>
+      <w:lvlJc w:val="left"/>
+      <w:pPr>
+        <w:ind w:left="2880" w:hanging="360"/>
+      </w:pPr>
+      <w:rPr>
+        <w:rFonts w:ascii="Symbol" w:hAnsi="Symbol" w:hint="default"/>
+      </w:rPr>
+    </w:lvl>
+    <w:lvl w:ilvl="4" w:tplc="0C0A0003" w:tentative="1">
+      <w:start w:val="1"/>
+      <w:numFmt w:val="bullet"/>
+      <w:lvlText w:val="o"/>
+      <w:lvlJc w:val="left"/>
+      <w:pPr>
+        <w:ind w:left="3600" w:hanging="360"/>
+      </w:pPr>
+      <w:rPr>
+        <w:rFonts w:ascii="Courier New" w:hAnsi="Courier New" w:cs="Courier New" w:hint="default"/>
+      </w:rPr>
+    </w:lvl>
+    <w:lvl w:ilvl="5" w:tplc="0C0A0005" w:tentative="1">
+      <w:start w:val="1"/>
+      <w:numFmt w:val="bullet"/>
+      <w:lvlText w:val=""/>
+      <w:lvlJc w:val="left"/>
+      <w:pPr>
+        <w:ind w:left="4320" w:hanging="360"/>
+      </w:pPr>
+      <w:rPr>
+        <w:rFonts w:ascii="Wingdings" w:hAnsi="Wingdings" w:hint="default"/>
+      </w:rPr>
+    </w:lvl>
+    <w:lvl w:ilvl="6" w:tplc="0C0A0001" w:tentative="1">
+      <w:start w:val="1"/>
+      <w:numFmt w:val="bullet"/>
+      <w:lvlText w:val=""/>
+      <w:lvlJc w:val="left"/>
+      <w:pPr>
+        <w:ind w:left="5040" w:hanging="360"/>
+      </w:pPr>
+      <w:rPr>
+        <w:rFonts w:ascii="Symbol" w:hAnsi="Symbol" w:hint="default"/>
+      </w:rPr>
+    </w:lvl>
+    <w:lvl w:ilvl="7" w:tplc="0C0A0003" w:tentative="1">
+      <w:start w:val="1"/>
+      <w:numFmt w:val="bullet"/>
+      <w:lvlText w:val="o"/>
+      <w:lvlJc w:val="left"/>
+      <w:pPr>
+        <w:ind w:left="5760" w:hanging="360"/>
+      </w:pPr>
+      <w:rPr>
+        <w:rFonts w:ascii="Courier New" w:hAnsi="Courier New" w:cs="Courier New" w:hint="default"/>
+      </w:rPr>
+    </w:lvl>
+    <w:lvl w:ilvl="8" w:tplc="0C0A0005" w:tentative="1">
+      <w:start w:val="1"/>
+      <w:numFmt w:val="bullet"/>
+      <w:lvlText w:val=""/>
+      <w:lvlJc w:val="left"/>
+      <w:pPr>
+        <w:ind w:left="6480" w:hanging="360"/>
+      </w:pPr>
+      <w:rPr>
+        <w:rFonts w:ascii="Wingdings" w:hAnsi="Wingdings" w:hint="default"/>
+      </w:rPr>
+    </w:lvl>
+  </w:abstractNum>
+  <w:abstractNum w:abstractNumId="11" w15:restartNumberingAfterBreak="0">
     <w:nsid w:val="6A017403"/>
     <w:multiLevelType w:val="multilevel"/>
     <w:tmpl w:val="C6789AC4"/>
@@ -3246,7 +4665,7 @@
       </w:rPr>
     </w:lvl>
   </w:abstractNum>
-  <w:abstractNum w:abstractNumId="5" w15:restartNumberingAfterBreak="0">
+  <w:abstractNum w:abstractNumId="12" w15:restartNumberingAfterBreak="0">
     <w:nsid w:val="6DC02588"/>
     <w:multiLevelType w:val="multilevel"/>
     <w:tmpl w:val="1B0ACA02"/>
@@ -3357,25 +4776,162 @@
         </w:tabs>
         <w:ind w:left="6480" w:hanging="360"/>
       </w:pPr>
+    </w:lvl>
+  </w:abstractNum>
+  <w:abstractNum w:abstractNumId="13" w15:restartNumberingAfterBreak="0">
+    <w:nsid w:val="6E9B7FAD"/>
+    <w:multiLevelType w:val="multilevel"/>
+    <w:tmpl w:val="CDEA2262"/>
+    <w:lvl w:ilvl="0">
+      <w:start w:val="1"/>
+      <w:numFmt w:val="bullet"/>
+      <w:lvlText w:val="●"/>
+      <w:lvlJc w:val="left"/>
+      <w:pPr>
+        <w:ind w:left="720" w:hanging="360"/>
+      </w:pPr>
+      <w:rPr>
+        <w:u w:val="none"/>
+      </w:rPr>
+    </w:lvl>
+    <w:lvl w:ilvl="1">
+      <w:start w:val="1"/>
+      <w:numFmt w:val="bullet"/>
+      <w:lvlText w:val="○"/>
+      <w:lvlJc w:val="left"/>
+      <w:pPr>
+        <w:ind w:left="1440" w:hanging="360"/>
+      </w:pPr>
+      <w:rPr>
+        <w:u w:val="none"/>
+      </w:rPr>
+    </w:lvl>
+    <w:lvl w:ilvl="2">
+      <w:start w:val="1"/>
+      <w:numFmt w:val="bullet"/>
+      <w:lvlText w:val="■"/>
+      <w:lvlJc w:val="left"/>
+      <w:pPr>
+        <w:ind w:left="2160" w:hanging="360"/>
+      </w:pPr>
+      <w:rPr>
+        <w:u w:val="none"/>
+      </w:rPr>
+    </w:lvl>
+    <w:lvl w:ilvl="3">
+      <w:start w:val="1"/>
+      <w:numFmt w:val="bullet"/>
+      <w:lvlText w:val="●"/>
+      <w:lvlJc w:val="left"/>
+      <w:pPr>
+        <w:ind w:left="2880" w:hanging="360"/>
+      </w:pPr>
+      <w:rPr>
+        <w:u w:val="none"/>
+      </w:rPr>
+    </w:lvl>
+    <w:lvl w:ilvl="4">
+      <w:start w:val="1"/>
+      <w:numFmt w:val="bullet"/>
+      <w:lvlText w:val="○"/>
+      <w:lvlJc w:val="left"/>
+      <w:pPr>
+        <w:ind w:left="3600" w:hanging="360"/>
+      </w:pPr>
+      <w:rPr>
+        <w:u w:val="none"/>
+      </w:rPr>
+    </w:lvl>
+    <w:lvl w:ilvl="5">
+      <w:start w:val="1"/>
+      <w:numFmt w:val="bullet"/>
+      <w:lvlText w:val="■"/>
+      <w:lvlJc w:val="left"/>
+      <w:pPr>
+        <w:ind w:left="4320" w:hanging="360"/>
+      </w:pPr>
+      <w:rPr>
+        <w:u w:val="none"/>
+      </w:rPr>
+    </w:lvl>
+    <w:lvl w:ilvl="6">
+      <w:start w:val="1"/>
+      <w:numFmt w:val="bullet"/>
+      <w:lvlText w:val="●"/>
+      <w:lvlJc w:val="left"/>
+      <w:pPr>
+        <w:ind w:left="5040" w:hanging="360"/>
+      </w:pPr>
+      <w:rPr>
+        <w:u w:val="none"/>
+      </w:rPr>
+    </w:lvl>
+    <w:lvl w:ilvl="7">
+      <w:start w:val="1"/>
+      <w:numFmt w:val="bullet"/>
+      <w:lvlText w:val="○"/>
+      <w:lvlJc w:val="left"/>
+      <w:pPr>
+        <w:ind w:left="5760" w:hanging="360"/>
+      </w:pPr>
+      <w:rPr>
+        <w:u w:val="none"/>
+      </w:rPr>
+    </w:lvl>
+    <w:lvl w:ilvl="8">
+      <w:start w:val="1"/>
+      <w:numFmt w:val="bullet"/>
+      <w:lvlText w:val="■"/>
+      <w:lvlJc w:val="left"/>
+      <w:pPr>
+        <w:ind w:left="6480" w:hanging="360"/>
+      </w:pPr>
+      <w:rPr>
+        <w:u w:val="none"/>
+      </w:rPr>
     </w:lvl>
   </w:abstractNum>
   <w:num w:numId="1" w16cid:durableId="863713764">
     <w:abstractNumId w:val="2"/>
   </w:num>
   <w:num w:numId="2" w16cid:durableId="1628002420">
-    <w:abstractNumId w:val="4"/>
+    <w:abstractNumId w:val="11"/>
   </w:num>
   <w:num w:numId="3" w16cid:durableId="389232645">
-    <w:abstractNumId w:val="3"/>
+    <w:abstractNumId w:val="7"/>
   </w:num>
   <w:num w:numId="4" w16cid:durableId="309402040">
-    <w:abstractNumId w:val="5"/>
+    <w:abstractNumId w:val="12"/>
   </w:num>
   <w:num w:numId="5" w16cid:durableId="660736507">
     <w:abstractNumId w:val="1"/>
   </w:num>
   <w:num w:numId="6" w16cid:durableId="522867550">
     <w:abstractNumId w:val="0"/>
+  </w:num>
+  <w:num w:numId="7" w16cid:durableId="108286799">
+    <w:abstractNumId w:val="5"/>
+  </w:num>
+  <w:num w:numId="8" w16cid:durableId="1404764502">
+    <w:abstractNumId w:val="13"/>
+  </w:num>
+  <w:num w:numId="9" w16cid:durableId="1193690311">
+    <w:abstractNumId w:val="4"/>
+  </w:num>
+  <w:num w:numId="10" w16cid:durableId="1925338614">
+    <w:abstractNumId w:val="8"/>
+  </w:num>
+  <w:num w:numId="11" w16cid:durableId="1368219404">
+    <w:abstractNumId w:val="6"/>
+  </w:num>
+  <w:num w:numId="12" w16cid:durableId="1480994165">
+    <w:abstractNumId w:val="3"/>
+  </w:num>
+  <w:num w:numId="13" w16cid:durableId="1647515151">
+    <w:abstractNumId w:val="10"/>
+  </w:num>
+  <w:num w:numId="14" w16cid:durableId="420562529">
+    <w:abstractNumId w:val="9"/>
   </w:num>
 </w:numbering>
 </file>
@@ -3834,10 +5390,31 @@
       <w:szCs w:val="26"/>
     </w:rPr>
   </w:style>
+  <w:style w:type="paragraph" w:styleId="Ttulo3">
+    <w:name w:val="heading 3"/>
+    <w:basedOn w:val="Normal"/>
+    <w:next w:val="Normal"/>
+    <w:link w:val="Ttulo3Car"/>
+    <w:uiPriority w:val="9"/>
+    <w:semiHidden/>
+    <w:unhideWhenUsed/>
+    <w:qFormat/>
+    <w:rsid w:val="00F379A8"/>
+    <w:pPr>
+      <w:keepNext/>
+      <w:keepLines/>
+      <w:spacing w:before="40" w:after="0"/>
+      <w:outlineLvl w:val="2"/>
+    </w:pPr>
+    <w:rPr>
+      <w:rFonts w:asciiTheme="majorHAnsi" w:eastAsiaTheme="majorEastAsia" w:hAnsiTheme="majorHAnsi" w:cstheme="majorBidi"/>
+      <w:color w:val="1F4D78" w:themeColor="accent1" w:themeShade="7F"/>
+      <w:szCs w:val="24"/>
+    </w:rPr>
+  </w:style>
   <w:style w:type="character" w:default="1" w:styleId="Fuentedeprrafopredeter">
     <w:name w:val="Default Paragraph Font"/>
     <w:uiPriority w:val="1"/>
-    <w:semiHidden/>
     <w:unhideWhenUsed/>
   </w:style>
   <w:style w:type="table" w:default="1" w:styleId="Tablanormal">
@@ -4048,6 +5625,21 @@
       <w:ind w:left="720"/>
       <w:contextualSpacing/>
     </w:pPr>
+  </w:style>
+  <w:style w:type="character" w:customStyle="1" w:styleId="Ttulo3Car">
+    <w:name w:val="Título 3 Car"/>
+    <w:basedOn w:val="Fuentedeprrafopredeter"/>
+    <w:link w:val="Ttulo3"/>
+    <w:uiPriority w:val="9"/>
+    <w:semiHidden/>
+    <w:rsid w:val="00F379A8"/>
+    <w:rPr>
+      <w:rFonts w:asciiTheme="majorHAnsi" w:eastAsiaTheme="majorEastAsia" w:hAnsiTheme="majorHAnsi" w:cstheme="majorBidi"/>
+      <w:color w:val="1F4D78" w:themeColor="accent1" w:themeShade="7F"/>
+      <w:sz w:val="24"/>
+      <w:szCs w:val="24"/>
+      <w:lang w:eastAsia="es-ES"/>
+    </w:rPr>
   </w:style>
 </w:styles>
 </file>

</xml_diff>

<commit_message>
Diagrama UML del model
</commit_message>
<xml_diff>
--- a/Documentacion/Proyecto/Memoria_proyecto_integrador.docx
+++ b/Documentacion/Proyecto/Memoria_proyecto_integrador.docx
@@ -3258,6 +3258,9 @@
     <w:p>
       <w:pPr>
         <w:pStyle w:val="Ttulo1"/>
+        <w:rPr>
+          <w:sz w:val="24"/>
+        </w:rPr>
       </w:pPr>
       <w:bookmarkStart w:id="14" w:name="_Toc224148685"/>
       <w:r>
@@ -3276,9 +3279,142 @@
     </w:p>
     <w:p>
       <w:r>
-        <w:t>…</w:t>
-      </w:r>
-    </w:p>
+        <w:t xml:space="preserve">El inicio del desarrollo de nuestro branding empresarial se remonta a </w:t>
+      </w:r>
+      <w:r>
+        <w:t>una</w:t>
+      </w:r>
+      <w:r>
+        <w:t xml:space="preserve"> lluvia de ideas inicial del nombre que representaría a nuestro producto; nuestra intención principal era transmitir elegancia y posicionamiento de marca “élite”. Paralelo a la búsqueda del nombre buscábamos una </w:t>
+      </w:r>
+      <w:r>
+        <w:t>representación gráfica que fuese sencilla</w:t>
+      </w:r>
+      <w:r>
+        <w:t xml:space="preserve"> </w:t>
+      </w:r>
+      <w:r>
+        <w:t xml:space="preserve">y memorable para los clientes sin contradecir a los valores de elegancia y prestigio que la marca quiere transmitir. </w:t>
+      </w:r>
+    </w:p>
+    <w:p>
+      <w:pPr>
+        <w:jc w:val="center"/>
+      </w:pPr>
+      <w:r>
+        <w:rPr>
+          <w:noProof/>
+        </w:rPr>
+        <w:drawing>
+          <wp:inline distT="0" distB="0" distL="0" distR="0" wp14:anchorId="57DDD20F" wp14:editId="1F15B391">
+            <wp:extent cx="2384279" cy="1775460"/>
+            <wp:effectExtent l="0" t="0" r="0" b="0"/>
+            <wp:docPr id="1361040477" name="Imagen 1"/>
+            <wp:cNvGraphicFramePr>
+              <a:graphicFrameLocks xmlns:a="http://schemas.openxmlformats.org/drawingml/2006/main" noChangeAspect="1"/>
+            </wp:cNvGraphicFramePr>
+            <a:graphic xmlns:a="http://schemas.openxmlformats.org/drawingml/2006/main">
+              <a:graphicData uri="http://schemas.openxmlformats.org/drawingml/2006/picture">
+                <pic:pic xmlns:pic="http://schemas.openxmlformats.org/drawingml/2006/picture">
+                  <pic:nvPicPr>
+                    <pic:cNvPr id="0" name="Picture 1"/>
+                    <pic:cNvPicPr>
+                      <a:picLocks noChangeAspect="1" noChangeArrowheads="1"/>
+                    </pic:cNvPicPr>
+                  </pic:nvPicPr>
+                  <pic:blipFill>
+                    <a:blip r:embed="rId15" cstate="print">
+                      <a:extLst>
+                        <a:ext uri="{28A0092B-C50C-407E-A947-70E740481C1C}">
+                          <a14:useLocalDpi xmlns:a14="http://schemas.microsoft.com/office/drawing/2010/main" val="0"/>
+                        </a:ext>
+                      </a:extLst>
+                    </a:blip>
+                    <a:srcRect/>
+                    <a:stretch>
+                      <a:fillRect/>
+                    </a:stretch>
+                  </pic:blipFill>
+                  <pic:spPr bwMode="auto">
+                    <a:xfrm>
+                      <a:off x="0" y="0"/>
+                      <a:ext cx="2388780" cy="1778812"/>
+                    </a:xfrm>
+                    <a:prstGeom prst="rect">
+                      <a:avLst/>
+                    </a:prstGeom>
+                    <a:noFill/>
+                    <a:ln>
+                      <a:noFill/>
+                    </a:ln>
+                  </pic:spPr>
+                </pic:pic>
+              </a:graphicData>
+            </a:graphic>
+          </wp:inline>
+        </w:drawing>
+      </w:r>
+    </w:p>
+    <w:p/>
+    <w:p>
+      <w:r>
+        <w:t>Después de evaluar la mayoría de las propuestas nos decantamos por el uso del nombre “</w:t>
+      </w:r>
+      <w:proofErr w:type="spellStart"/>
+      <w:r>
+        <w:t>AntiCape</w:t>
+      </w:r>
+      <w:proofErr w:type="spellEnd"/>
+      <w:r>
+        <w:t>-Corp”; la elección de este nombre se basó en dos principios. En primer lugar, la influencia de la política interna de la clienta Edna Moda cuy</w:t>
+      </w:r>
+      <w:r>
+        <w:t>a mayor normativa de diseño es “¡Nada de capas!”.</w:t>
+      </w:r>
+      <w:r>
+        <w:t xml:space="preserve"> No quisimos que esto quedara como un simple eslogan, por lo que planteamos varias ideas que representaran esta icónica referencia a Edna y </w:t>
+      </w:r>
+      <w:proofErr w:type="spellStart"/>
+      <w:r>
+        <w:t>AntiCape</w:t>
+      </w:r>
+      <w:proofErr w:type="spellEnd"/>
+      <w:r>
+        <w:t xml:space="preserve"> cumplía con este rol. Como pauta final para la elección del nombre, pensamos en agregar una abreviatura que sumara peso empresarial </w:t>
+      </w:r>
+      <w:r>
+        <w:t>y estatus comercial a la marca, la alternativa que más concordaba con este planteamiento es la abreviatura a “</w:t>
+      </w:r>
+      <w:proofErr w:type="spellStart"/>
+      <w:r>
+        <w:t>corporation</w:t>
+      </w:r>
+      <w:proofErr w:type="spellEnd"/>
+      <w:r>
+        <w:t>”, es decir, “Corp”.</w:t>
+      </w:r>
+    </w:p>
+    <w:p>
+      <w:r>
+        <w:t>En referencia a la elección del diseño del logo, quisimos que fuese sencillo pero elegante a su vez por lo que nos inspiramos en la tipografía “</w:t>
+      </w:r>
+      <w:proofErr w:type="spellStart"/>
+      <w:r>
+        <w:t>Ribon</w:t>
+      </w:r>
+      <w:proofErr w:type="spellEnd"/>
+      <w:r>
+        <w:t xml:space="preserve"> 131” la cual nos permitió conseguir esta estética. </w:t>
+      </w:r>
+      <w:r>
+        <w:t xml:space="preserve">Evidentemente al tratarse de una empresa enfocada en el diseño de trajes, vimos como una prioridad incorporar un elemento grafico representativo a el universo de la costura; </w:t>
+      </w:r>
+      <w:r>
+        <w:lastRenderedPageBreak/>
+        <w:t>la elección fue clara, una aguja de costura, el elemento por excelencia si nos referimos a el mundo de la moda. (colores) lujo silencioso</w:t>
+      </w:r>
+    </w:p>
+    <w:p/>
     <w:p>
       <w:r>
         <w:t xml:space="preserve">Incluirse </w:t>
@@ -3352,8 +3488,8 @@
     </w:p>
     <w:p/>
     <w:sectPr>
-      <w:headerReference w:type="default" r:id="rId15"/>
-      <w:footerReference w:type="default" r:id="rId16"/>
+      <w:headerReference w:type="default" r:id="rId16"/>
+      <w:footerReference w:type="default" r:id="rId17"/>
       <w:pgSz w:w="11906" w:h="16838"/>
       <w:pgMar w:top="1418" w:right="1418" w:bottom="1418" w:left="1418" w:header="709" w:footer="709" w:gutter="0"/>
       <w:pgNumType w:start="0"/>

</xml_diff>